<commit_message>
Update Security Requirements and Component Diagram
</commit_message>
<xml_diff>
--- a/Documents/Security_Requirements_Specification.docx
+++ b/Documents/Security_Requirements_Specification.docx
@@ -8605,7 +8605,7 @@
                 <w:sz w:val="20"/>
                 <w:szCs w:val="20"/>
               </w:rPr>
-              <w:t xml:space="preserve">Only the Admin can manage faculty, classes/sections, user roles, attendance thresholds, and backup/restore.</w:t>
+              <w:t xml:space="preserve">Only the Admin can manage student records, faculty, classes/sections, user roles, attendance thresholds, and backup/restore.</w:t>
             </w:r>
           </w:p>
         </w:tc>
@@ -8807,7 +8807,7 @@
                 <w:sz w:val="20"/>
                 <w:szCs w:val="20"/>
               </w:rPr>
-              <w:t xml:space="preserve">Account creation, deactivation, role changes and password resets are logged with the acting user and timestamp.</w:t>
+              <w:t xml:space="preserve">Account creation, deactivation, reactivation, permanent deletion (with the reason), role changes and password resets are logged with the acting user and timestamp.</w:t>
             </w:r>
           </w:p>
         </w:tc>
@@ -9514,7 +9514,7 @@
                 <w:sz w:val="20"/>
                 <w:szCs w:val="20"/>
               </w:rPr>
-              <w:t xml:space="preserve">Attendance corrections are allowed only within the configured correction window (set by the Admin; suggested 7 days). Edits outside it need Admin authorization and are logged.</w:t>
+              <w:t xml:space="preserve">Faculty attendance corrections are allowed only within the configured correction window (set by the Admin; default 2 calendar days after the session date). Edits outside it can be made only by the Admin with a mandatory reason and are logged.</w:t>
             </w:r>
           </w:p>
         </w:tc>
@@ -9716,7 +9716,7 @@
                 <w:sz w:val="20"/>
                 <w:szCs w:val="20"/>
               </w:rPr>
-              <w:t xml:space="preserve">Low-attendance notifications go only to the affected student (and optionally their faculty) and contain minimal personal data.</w:t>
+              <w:t xml:space="preserve">Low-attendance notifications go only to the affected student; faculty receive only the list of their own students below the threshold. Both contain minimal personal data.</w:t>
             </w:r>
           </w:p>
         </w:tc>
@@ -13000,7 +13000,7 @@
                 <w:sz w:val="20"/>
                 <w:szCs w:val="20"/>
               </w:rPr>
-              <w:t xml:space="preserve">FR-04, FR-06, FR-19</w:t>
+              <w:t xml:space="preserve">FR-03, FR-04, FR-06, FR-19</w:t>
             </w:r>
           </w:p>
         </w:tc>
@@ -13032,7 +13032,7 @@
                 <w:sz w:val="20"/>
                 <w:szCs w:val="20"/>
               </w:rPr>
-              <w:t xml:space="preserve">Test: Faculty and Student attempts to use each admin function are denied.</w:t>
+              <w:t xml:space="preserve">Test: Faculty and Student attempts to use each admin function, including student management, are denied.</w:t>
             </w:r>
           </w:p>
         </w:tc>
@@ -13426,7 +13426,7 @@
                 <w:sz w:val="20"/>
                 <w:szCs w:val="20"/>
               </w:rPr>
-              <w:t xml:space="preserve">Test: perform each account action and check that a log entry with user and time exists.</w:t>
+              <w:t xml:space="preserve">Test: perform each account action and check that a log entry with user and time exists; a deletion also records the reason.</w:t>
             </w:r>
           </w:p>
         </w:tc>
@@ -14773,7 +14773,7 @@
                 <w:sz w:val="20"/>
                 <w:szCs w:val="20"/>
               </w:rPr>
-              <w:t xml:space="preserve">UC-07 (3a), NFR-10</w:t>
+              <w:t xml:space="preserve">UC-07 (3a, 3c), NFR-10</w:t>
             </w:r>
           </w:p>
         </w:tc>
@@ -14805,7 +14805,7 @@
                 <w:sz w:val="20"/>
                 <w:szCs w:val="20"/>
               </w:rPr>
-              <w:t xml:space="preserve">Test: an edit inside the window succeeds; an edit outside it is blocked until the Admin authorizes it, and both are logged.</w:t>
+              <w:t xml:space="preserve">Test: session on 6 Oct: a faculty edit on 8 Oct 23:59 succeeds, one on 9 Oct 00:00 is blocked; an Admin edit with a reason succeeds; all are logged.</w:t>
             </w:r>
           </w:p>
         </w:tc>
@@ -15199,7 +15199,7 @@
                 <w:sz w:val="20"/>
                 <w:szCs w:val="20"/>
               </w:rPr>
-              <w:t xml:space="preserve">Test: trigger a notification; only the affected student receives it and it holds no extra personal data.</w:t>
+              <w:t xml:space="preserve">Test: trigger a notification; only the affected student receives it, faculty see only their own students, and neither holds extra personal data.</w:t>
             </w:r>
           </w:p>
         </w:tc>

</xml_diff>

<commit_message>
feat(accounts): add OTP two-factor login (#40)
</commit_message>
<xml_diff>
--- a/Documents/Security_Requirements_Specification.docx
+++ b/Documents/Security_Requirements_Specification.docx
@@ -76,7 +76,7 @@
         <w:spacing w:after="120"/>
       </w:pPr>
       <w:r>
-        <w:t xml:space="preserve">Following the Security Risk Assessment process, this document identifies assets and stakeholders, identifies threats and attackers, analyzes each risk by likelihood and impact, and defines mitigations. The results lead to security objectives and to security requirements SEC-01 to SEC-28. Each requirement is clear, testable, and traceable to specific threats and objectives.</w:t>
+        <w:t xml:space="preserve">Following the Security Risk Assessment process, this document identifies assets and stakeholders, identifies threats and attackers, analyzes each risk by likelihood and impact, and defines mitigations. The results lead to security objectives and to security requirements SEC-01 to SEC-32. Each requirement is clear, testable, and traceable to specific threats and objectives.</w:t>
       </w:r>
     </w:p>
     <w:p>
@@ -4472,7 +4472,7 @@
                 <w:sz w:val="20"/>
                 <w:szCs w:val="20"/>
               </w:rPr>
-              <w:t xml:space="preserve">SEC-02, SEC-03, SEC-04, SEC-22</w:t>
+              <w:t xml:space="preserve">SEC-02, SEC-03, SEC-04, SEC-22, SEC-29, SEC-32</w:t>
             </w:r>
           </w:p>
         </w:tc>
@@ -4637,7 +4637,7 @@
                 <w:sz w:val="20"/>
                 <w:szCs w:val="20"/>
               </w:rPr>
-              <w:t xml:space="preserve">SEC-04, SEC-05, SEC-06, SEC-07</w:t>
+              <w:t xml:space="preserve">SEC-04, SEC-05, SEC-06, SEC-07, SEC-29, SEC-30, SEC-31</w:t>
             </w:r>
           </w:p>
         </w:tc>
@@ -6739,7 +6739,7 @@
                 <w:sz w:val="20"/>
                 <w:szCs w:val="20"/>
               </w:rPr>
-              <w:t xml:space="preserve">Only verified users hold a session, and credentials are protected. Target: lockout after 5 failed logins, session expiry after 15 minutes idle, no plain-text passwords stored.</w:t>
+              <w:t xml:space="preserve">Only verified users hold a session, and credentials are protected. Target: lockout after 5 failed logins, session expiry after 15 minutes idle, no plain-text passwords stored, and every login requires a second factor (OTP).</w:t>
             </w:r>
           </w:p>
         </w:tc>
@@ -10020,6 +10020,410 @@
                 <w:szCs w:val="20"/>
               </w:rPr>
               <w:t xml:space="preserve">No default accounts or credentials exist in production, and secrets (database credentials, keys) are not stored in source code.</w:t>
+            </w:r>
+          </w:p>
+        </w:tc>
+      </w:tr>
+      <w:tr>
+        <w:trPr>
+          <w:cantSplit/>
+        </w:trPr>
+        <w:tc>
+          <w:tcPr>
+            <w:tcW w:type="dxa" w:w="1000"/>
+            <w:tcBorders>
+              <w:top w:val="single" w:color="000000" w:sz="4"/>
+              <w:left w:val="single" w:color="000000" w:sz="4"/>
+              <w:bottom w:val="single" w:color="000000" w:sz="4"/>
+              <w:right w:val="single" w:color="000000" w:sz="4"/>
+            </w:tcBorders>
+            <w:tcMar>
+              <w:top w:type="dxa" w:w="70"/>
+              <w:left w:type="dxa" w:w="100"/>
+              <w:bottom w:type="dxa" w:w="70"/>
+              <w:right w:type="dxa" w:w="100"/>
+            </w:tcMar>
+            <w:vAlign w:val="center"/>
+          </w:tcPr>
+          <w:p>
+            <w:pPr>
+              <w:jc w:val="left"/>
+            </w:pPr>
+            <w:r>
+              <w:rPr>
+                <w:b/>
+                <w:bCs/>
+                <w:sz w:val="20"/>
+                <w:szCs w:val="20"/>
+              </w:rPr>
+              <w:t xml:space="preserve">SEC-29</w:t>
+            </w:r>
+          </w:p>
+        </w:tc>
+        <w:tc>
+          <w:tcPr>
+            <w:tcW w:type="dxa" w:w="2600"/>
+            <w:tcBorders>
+              <w:top w:val="single" w:color="000000" w:sz="4"/>
+              <w:left w:val="single" w:color="000000" w:sz="4"/>
+              <w:bottom w:val="single" w:color="000000" w:sz="4"/>
+              <w:right w:val="single" w:color="000000" w:sz="4"/>
+            </w:tcBorders>
+            <w:tcMar>
+              <w:top w:type="dxa" w:w="70"/>
+              <w:left w:type="dxa" w:w="100"/>
+              <w:bottom w:type="dxa" w:w="70"/>
+              <w:right w:type="dxa" w:w="100"/>
+            </w:tcMar>
+            <w:vAlign w:val="center"/>
+          </w:tcPr>
+          <w:p>
+            <w:pPr>
+              <w:jc w:val="left"/>
+            </w:pPr>
+            <w:r>
+              <w:rPr>
+                <w:b/>
+                <w:bCs/>
+                <w:sz w:val="20"/>
+                <w:szCs w:val="20"/>
+              </w:rPr>
+              <w:t xml:space="preserve">Two-Factor Login (OTP)</w:t>
+            </w:r>
+          </w:p>
+        </w:tc>
+        <w:tc>
+          <w:tcPr>
+            <w:tcW w:type="dxa" w:w="5800"/>
+            <w:tcBorders>
+              <w:top w:val="single" w:color="000000" w:sz="4"/>
+              <w:left w:val="single" w:color="000000" w:sz="4"/>
+              <w:bottom w:val="single" w:color="000000" w:sz="4"/>
+              <w:right w:val="single" w:color="000000" w:sz="4"/>
+            </w:tcBorders>
+            <w:tcMar>
+              <w:top w:type="dxa" w:w="70"/>
+              <w:left w:type="dxa" w:w="100"/>
+              <w:bottom w:type="dxa" w:w="70"/>
+              <w:right w:type="dxa" w:w="100"/>
+            </w:tcMar>
+            <w:vAlign w:val="center"/>
+          </w:tcPr>
+          <w:p>
+            <w:pPr>
+              <w:jc w:val="left"/>
+            </w:pPr>
+            <w:r>
+              <w:rPr>
+                <w:b w:val="false"/>
+                <w:bCs w:val="false"/>
+                <w:sz w:val="20"/>
+                <w:szCs w:val="20"/>
+              </w:rPr>
+              <w:t xml:space="preserve">After the password, every user (Admin, Faculty and Student) enters a one-time 6-digit code. The main method is an authenticator app (time-based codes that change every 30 seconds); a code sent by email is the backup method. There is no "remember this device" option.</w:t>
+            </w:r>
+          </w:p>
+        </w:tc>
+      </w:tr>
+      <w:tr>
+        <w:trPr>
+          <w:cantSplit/>
+        </w:trPr>
+        <w:tc>
+          <w:tcPr>
+            <w:tcW w:type="dxa" w:w="1000"/>
+            <w:tcBorders>
+              <w:top w:val="single" w:color="000000" w:sz="4"/>
+              <w:left w:val="single" w:color="000000" w:sz="4"/>
+              <w:bottom w:val="single" w:color="000000" w:sz="4"/>
+              <w:right w:val="single" w:color="000000" w:sz="4"/>
+            </w:tcBorders>
+            <w:tcMar>
+              <w:top w:type="dxa" w:w="70"/>
+              <w:left w:type="dxa" w:w="100"/>
+              <w:bottom w:type="dxa" w:w="70"/>
+              <w:right w:type="dxa" w:w="100"/>
+            </w:tcMar>
+            <w:vAlign w:val="center"/>
+          </w:tcPr>
+          <w:p>
+            <w:pPr>
+              <w:jc w:val="left"/>
+            </w:pPr>
+            <w:r>
+              <w:rPr>
+                <w:b/>
+                <w:bCs/>
+                <w:sz w:val="20"/>
+                <w:szCs w:val="20"/>
+              </w:rPr>
+              <w:t xml:space="preserve">SEC-30</w:t>
+            </w:r>
+          </w:p>
+        </w:tc>
+        <w:tc>
+          <w:tcPr>
+            <w:tcW w:type="dxa" w:w="2600"/>
+            <w:tcBorders>
+              <w:top w:val="single" w:color="000000" w:sz="4"/>
+              <w:left w:val="single" w:color="000000" w:sz="4"/>
+              <w:bottom w:val="single" w:color="000000" w:sz="4"/>
+              <w:right w:val="single" w:color="000000" w:sz="4"/>
+            </w:tcBorders>
+            <w:tcMar>
+              <w:top w:type="dxa" w:w="70"/>
+              <w:left w:type="dxa" w:w="100"/>
+              <w:bottom w:type="dxa" w:w="70"/>
+              <w:right w:type="dxa" w:w="100"/>
+            </w:tcMar>
+            <w:vAlign w:val="center"/>
+          </w:tcPr>
+          <w:p>
+            <w:pPr>
+              <w:jc w:val="left"/>
+            </w:pPr>
+            <w:r>
+              <w:rPr>
+                <w:b/>
+                <w:bCs/>
+                <w:sz w:val="20"/>
+                <w:szCs w:val="20"/>
+              </w:rPr>
+              <w:t xml:space="preserve">OTP Setup &amp; Secret Protection</w:t>
+            </w:r>
+          </w:p>
+        </w:tc>
+        <w:tc>
+          <w:tcPr>
+            <w:tcW w:type="dxa" w:w="5800"/>
+            <w:tcBorders>
+              <w:top w:val="single" w:color="000000" w:sz="4"/>
+              <w:left w:val="single" w:color="000000" w:sz="4"/>
+              <w:bottom w:val="single" w:color="000000" w:sz="4"/>
+              <w:right w:val="single" w:color="000000" w:sz="4"/>
+            </w:tcBorders>
+            <w:tcMar>
+              <w:top w:type="dxa" w:w="70"/>
+              <w:left w:type="dxa" w:w="100"/>
+              <w:bottom w:type="dxa" w:w="70"/>
+              <w:right w:type="dxa" w:w="100"/>
+            </w:tcMar>
+            <w:vAlign w:val="center"/>
+          </w:tcPr>
+          <w:p>
+            <w:pPr>
+              <w:jc w:val="left"/>
+            </w:pPr>
+            <w:r>
+              <w:rPr>
+                <w:b w:val="false"/>
+                <w:bCs w:val="false"/>
+                <w:sz w:val="20"/>
+                <w:szCs w:val="20"/>
+              </w:rPr>
+              <w:t xml:space="preserve">Each user sets up the authenticator app at first login by scanning a QR code and confirming one code. The setup secret is shown only during setup, is never logged or emailed, and is kept in access-restricted storage.</w:t>
+            </w:r>
+          </w:p>
+        </w:tc>
+      </w:tr>
+      <w:tr>
+        <w:trPr>
+          <w:cantSplit/>
+        </w:trPr>
+        <w:tc>
+          <w:tcPr>
+            <w:tcW w:type="dxa" w:w="1000"/>
+            <w:tcBorders>
+              <w:top w:val="single" w:color="000000" w:sz="4"/>
+              <w:left w:val="single" w:color="000000" w:sz="4"/>
+              <w:bottom w:val="single" w:color="000000" w:sz="4"/>
+              <w:right w:val="single" w:color="000000" w:sz="4"/>
+            </w:tcBorders>
+            <w:tcMar>
+              <w:top w:type="dxa" w:w="70"/>
+              <w:left w:type="dxa" w:w="100"/>
+              <w:bottom w:type="dxa" w:w="70"/>
+              <w:right w:type="dxa" w:w="100"/>
+            </w:tcMar>
+            <w:vAlign w:val="center"/>
+          </w:tcPr>
+          <w:p>
+            <w:pPr>
+              <w:jc w:val="left"/>
+            </w:pPr>
+            <w:r>
+              <w:rPr>
+                <w:b/>
+                <w:bCs/>
+                <w:sz w:val="20"/>
+                <w:szCs w:val="20"/>
+              </w:rPr>
+              <w:t xml:space="preserve">SEC-31</w:t>
+            </w:r>
+          </w:p>
+        </w:tc>
+        <w:tc>
+          <w:tcPr>
+            <w:tcW w:type="dxa" w:w="2600"/>
+            <w:tcBorders>
+              <w:top w:val="single" w:color="000000" w:sz="4"/>
+              <w:left w:val="single" w:color="000000" w:sz="4"/>
+              <w:bottom w:val="single" w:color="000000" w:sz="4"/>
+              <w:right w:val="single" w:color="000000" w:sz="4"/>
+            </w:tcBorders>
+            <w:tcMar>
+              <w:top w:type="dxa" w:w="70"/>
+              <w:left w:type="dxa" w:w="100"/>
+              <w:bottom w:type="dxa" w:w="70"/>
+              <w:right w:type="dxa" w:w="100"/>
+            </w:tcMar>
+            <w:vAlign w:val="center"/>
+          </w:tcPr>
+          <w:p>
+            <w:pPr>
+              <w:jc w:val="left"/>
+            </w:pPr>
+            <w:r>
+              <w:rPr>
+                <w:b/>
+                <w:bCs/>
+                <w:sz w:val="20"/>
+                <w:szCs w:val="20"/>
+              </w:rPr>
+              <w:t xml:space="preserve">Backup Codes &amp; OTP Reset</w:t>
+            </w:r>
+          </w:p>
+        </w:tc>
+        <w:tc>
+          <w:tcPr>
+            <w:tcW w:type="dxa" w:w="5800"/>
+            <w:tcBorders>
+              <w:top w:val="single" w:color="000000" w:sz="4"/>
+              <w:left w:val="single" w:color="000000" w:sz="4"/>
+              <w:bottom w:val="single" w:color="000000" w:sz="4"/>
+              <w:right w:val="single" w:color="000000" w:sz="4"/>
+            </w:tcBorders>
+            <w:tcMar>
+              <w:top w:type="dxa" w:w="70"/>
+              <w:left w:type="dxa" w:w="100"/>
+              <w:bottom w:type="dxa" w:w="70"/>
+              <w:right w:type="dxa" w:w="100"/>
+            </w:tcMar>
+            <w:vAlign w:val="center"/>
+          </w:tcPr>
+          <w:p>
+            <w:pPr>
+              <w:jc w:val="left"/>
+            </w:pPr>
+            <w:r>
+              <w:rPr>
+                <w:b w:val="false"/>
+                <w:bCs w:val="false"/>
+                <w:sz w:val="20"/>
+                <w:szCs w:val="20"/>
+              </w:rPr>
+              <w:t xml:space="preserve">At setup each user receives 10 single-use backup codes, shown once and stored only as hashes. An Admin can reset another user's OTP after re-entering their own password; the reset is logged and the user sets up OTP again at next login.</w:t>
+            </w:r>
+          </w:p>
+        </w:tc>
+      </w:tr>
+      <w:tr>
+        <w:trPr>
+          <w:cantSplit/>
+        </w:trPr>
+        <w:tc>
+          <w:tcPr>
+            <w:tcW w:type="dxa" w:w="1000"/>
+            <w:tcBorders>
+              <w:top w:val="single" w:color="000000" w:sz="4"/>
+              <w:left w:val="single" w:color="000000" w:sz="4"/>
+              <w:bottom w:val="single" w:color="000000" w:sz="4"/>
+              <w:right w:val="single" w:color="000000" w:sz="4"/>
+            </w:tcBorders>
+            <w:tcMar>
+              <w:top w:type="dxa" w:w="70"/>
+              <w:left w:type="dxa" w:w="100"/>
+              <w:bottom w:type="dxa" w:w="70"/>
+              <w:right w:type="dxa" w:w="100"/>
+            </w:tcMar>
+            <w:vAlign w:val="center"/>
+          </w:tcPr>
+          <w:p>
+            <w:pPr>
+              <w:jc w:val="left"/>
+            </w:pPr>
+            <w:r>
+              <w:rPr>
+                <w:b/>
+                <w:bCs/>
+                <w:sz w:val="20"/>
+                <w:szCs w:val="20"/>
+              </w:rPr>
+              <w:t xml:space="preserve">SEC-32</w:t>
+            </w:r>
+          </w:p>
+        </w:tc>
+        <w:tc>
+          <w:tcPr>
+            <w:tcW w:type="dxa" w:w="2600"/>
+            <w:tcBorders>
+              <w:top w:val="single" w:color="000000" w:sz="4"/>
+              <w:left w:val="single" w:color="000000" w:sz="4"/>
+              <w:bottom w:val="single" w:color="000000" w:sz="4"/>
+              <w:right w:val="single" w:color="000000" w:sz="4"/>
+            </w:tcBorders>
+            <w:tcMar>
+              <w:top w:type="dxa" w:w="70"/>
+              <w:left w:type="dxa" w:w="100"/>
+              <w:bottom w:type="dxa" w:w="70"/>
+              <w:right w:type="dxa" w:w="100"/>
+            </w:tcMar>
+            <w:vAlign w:val="center"/>
+          </w:tcPr>
+          <w:p>
+            <w:pPr>
+              <w:jc w:val="left"/>
+            </w:pPr>
+            <w:r>
+              <w:rPr>
+                <w:b/>
+                <w:bCs/>
+                <w:sz w:val="20"/>
+                <w:szCs w:val="20"/>
+              </w:rPr>
+              <w:t xml:space="preserve">OTP Attempt Limits &amp; Code Expiry</w:t>
+            </w:r>
+          </w:p>
+        </w:tc>
+        <w:tc>
+          <w:tcPr>
+            <w:tcW w:type="dxa" w:w="5800"/>
+            <w:tcBorders>
+              <w:top w:val="single" w:color="000000" w:sz="4"/>
+              <w:left w:val="single" w:color="000000" w:sz="4"/>
+              <w:bottom w:val="single" w:color="000000" w:sz="4"/>
+              <w:right w:val="single" w:color="000000" w:sz="4"/>
+            </w:tcBorders>
+            <w:tcMar>
+              <w:top w:type="dxa" w:w="70"/>
+              <w:left w:type="dxa" w:w="100"/>
+              <w:bottom w:type="dxa" w:w="70"/>
+              <w:right w:type="dxa" w:w="100"/>
+            </w:tcMar>
+            <w:vAlign w:val="center"/>
+          </w:tcPr>
+          <w:p>
+            <w:pPr>
+              <w:jc w:val="left"/>
+            </w:pPr>
+            <w:r>
+              <w:rPr>
+                <w:b w:val="false"/>
+                <w:bCs w:val="false"/>
+                <w:sz w:val="20"/>
+                <w:szCs w:val="20"/>
+              </w:rPr>
+              <w:t xml:space="preserve">5 consecutive wrong codes lock the account for 15 minutes. Emailed codes are valid for 10 minutes and work once; at most 3 emailed codes can be requested in 15 minutes. Every OTP setup, success, failure, lockout and reset is logged.</w:t>
             </w:r>
           </w:p>
         </w:tc>
@@ -15791,6 +16195,794 @@
                 <w:szCs w:val="20"/>
               </w:rPr>
               <w:t xml:space="preserve">Inspection: scan the production setup and source code for default accounts and hard-coded secrets and find none.</w:t>
+            </w:r>
+          </w:p>
+        </w:tc>
+      </w:tr>
+      <w:tr>
+        <w:trPr>
+          <w:cantSplit/>
+        </w:trPr>
+        <w:tc>
+          <w:tcPr>
+            <w:tcW w:type="dxa" w:w="800"/>
+            <w:tcBorders>
+              <w:top w:val="single" w:color="000000" w:sz="4"/>
+              <w:left w:val="single" w:color="000000" w:sz="4"/>
+              <w:bottom w:val="single" w:color="000000" w:sz="4"/>
+              <w:right w:val="single" w:color="000000" w:sz="4"/>
+            </w:tcBorders>
+            <w:tcMar>
+              <w:top w:type="dxa" w:w="70"/>
+              <w:left w:type="dxa" w:w="100"/>
+              <w:bottom w:type="dxa" w:w="70"/>
+              <w:right w:type="dxa" w:w="100"/>
+            </w:tcMar>
+            <w:vAlign w:val="center"/>
+          </w:tcPr>
+          <w:p>
+            <w:pPr>
+              <w:jc w:val="left"/>
+            </w:pPr>
+            <w:r>
+              <w:rPr>
+                <w:b/>
+                <w:bCs/>
+                <w:sz w:val="20"/>
+                <w:szCs w:val="20"/>
+              </w:rPr>
+              <w:t xml:space="preserve">SEC-29</w:t>
+            </w:r>
+          </w:p>
+        </w:tc>
+        <w:tc>
+          <w:tcPr>
+            <w:tcW w:type="dxa" w:w="1350"/>
+            <w:tcBorders>
+              <w:top w:val="single" w:color="000000" w:sz="4"/>
+              <w:left w:val="single" w:color="000000" w:sz="4"/>
+              <w:bottom w:val="single" w:color="000000" w:sz="4"/>
+              <w:right w:val="single" w:color="000000" w:sz="4"/>
+            </w:tcBorders>
+            <w:tcMar>
+              <w:top w:type="dxa" w:w="70"/>
+              <w:left w:type="dxa" w:w="100"/>
+              <w:bottom w:type="dxa" w:w="70"/>
+              <w:right w:type="dxa" w:w="100"/>
+            </w:tcMar>
+            <w:vAlign w:val="center"/>
+          </w:tcPr>
+          <w:p>
+            <w:pPr>
+              <w:jc w:val="left"/>
+            </w:pPr>
+            <w:r>
+              <w:rPr>
+                <w:b w:val="false"/>
+                <w:bCs w:val="false"/>
+                <w:sz w:val="20"/>
+                <w:szCs w:val="20"/>
+              </w:rPr>
+              <w:t xml:space="preserve">TH-01, TH-02</w:t>
+            </w:r>
+          </w:p>
+        </w:tc>
+        <w:tc>
+          <w:tcPr>
+            <w:tcW w:type="dxa" w:w="1200"/>
+            <w:tcBorders>
+              <w:top w:val="single" w:color="000000" w:sz="4"/>
+              <w:left w:val="single" w:color="000000" w:sz="4"/>
+              <w:bottom w:val="single" w:color="000000" w:sz="4"/>
+              <w:right w:val="single" w:color="000000" w:sz="4"/>
+            </w:tcBorders>
+            <w:tcMar>
+              <w:top w:type="dxa" w:w="70"/>
+              <w:left w:type="dxa" w:w="100"/>
+              <w:bottom w:type="dxa" w:w="70"/>
+              <w:right w:type="dxa" w:w="100"/>
+            </w:tcMar>
+            <w:vAlign w:val="center"/>
+          </w:tcPr>
+          <w:p>
+            <w:pPr>
+              <w:jc w:val="left"/>
+            </w:pPr>
+            <w:r>
+              <w:rPr>
+                <w:b w:val="false"/>
+                <w:bCs w:val="false"/>
+                <w:sz w:val="20"/>
+                <w:szCs w:val="20"/>
+              </w:rPr>
+              <w:t xml:space="preserve">OBJ-03</w:t>
+            </w:r>
+          </w:p>
+        </w:tc>
+        <w:tc>
+          <w:tcPr>
+            <w:tcW w:type="dxa" w:w="1050"/>
+            <w:tcBorders>
+              <w:top w:val="single" w:color="000000" w:sz="4"/>
+              <w:left w:val="single" w:color="000000" w:sz="4"/>
+              <w:bottom w:val="single" w:color="000000" w:sz="4"/>
+              <w:right w:val="single" w:color="000000" w:sz="4"/>
+            </w:tcBorders>
+            <w:tcMar>
+              <w:top w:type="dxa" w:w="70"/>
+              <w:left w:type="dxa" w:w="100"/>
+              <w:bottom w:type="dxa" w:w="70"/>
+              <w:right w:type="dxa" w:w="100"/>
+            </w:tcMar>
+            <w:vAlign w:val="center"/>
+          </w:tcPr>
+          <w:p>
+            <w:pPr>
+              <w:jc w:val="center"/>
+            </w:pPr>
+            <w:r>
+              <w:rPr>
+                <w:b w:val="false"/>
+                <w:bCs w:val="false"/>
+                <w:sz w:val="20"/>
+                <w:szCs w:val="20"/>
+              </w:rPr>
+              <w:t xml:space="preserve">High</w:t>
+            </w:r>
+          </w:p>
+        </w:tc>
+        <w:tc>
+          <w:tcPr>
+            <w:tcW w:type="dxa" w:w="1400"/>
+            <w:tcBorders>
+              <w:top w:val="single" w:color="000000" w:sz="4"/>
+              <w:left w:val="single" w:color="000000" w:sz="4"/>
+              <w:bottom w:val="single" w:color="000000" w:sz="4"/>
+              <w:right w:val="single" w:color="000000" w:sz="4"/>
+            </w:tcBorders>
+            <w:tcMar>
+              <w:top w:type="dxa" w:w="70"/>
+              <w:left w:type="dxa" w:w="100"/>
+              <w:bottom w:type="dxa" w:w="70"/>
+              <w:right w:type="dxa" w:w="100"/>
+            </w:tcMar>
+            <w:vAlign w:val="center"/>
+          </w:tcPr>
+          <w:p>
+            <w:pPr>
+              <w:jc w:val="left"/>
+            </w:pPr>
+            <w:r>
+              <w:rPr>
+                <w:b w:val="false"/>
+                <w:bCs w:val="false"/>
+                <w:sz w:val="20"/>
+                <w:szCs w:val="20"/>
+              </w:rPr>
+              <w:t xml:space="preserve">FR-21, UC-01 (4)</w:t>
+            </w:r>
+          </w:p>
+        </w:tc>
+        <w:tc>
+          <w:tcPr>
+            <w:tcW w:type="dxa" w:w="3600"/>
+            <w:tcBorders>
+              <w:top w:val="single" w:color="000000" w:sz="4"/>
+              <w:left w:val="single" w:color="000000" w:sz="4"/>
+              <w:bottom w:val="single" w:color="000000" w:sz="4"/>
+              <w:right w:val="single" w:color="000000" w:sz="4"/>
+            </w:tcBorders>
+            <w:tcMar>
+              <w:top w:type="dxa" w:w="70"/>
+              <w:left w:type="dxa" w:w="100"/>
+              <w:bottom w:type="dxa" w:w="70"/>
+              <w:right w:type="dxa" w:w="100"/>
+            </w:tcMar>
+            <w:vAlign w:val="center"/>
+          </w:tcPr>
+          <w:p>
+            <w:pPr>
+              <w:jc w:val="left"/>
+            </w:pPr>
+            <w:r>
+              <w:rPr>
+                <w:b w:val="false"/>
+                <w:bCs w:val="false"/>
+                <w:sz w:val="20"/>
+                <w:szCs w:val="20"/>
+              </w:rPr>
+              <w:t xml:space="preserve">Test: a correct password without a code, or with a wrong code, never reaches a dashboard; a correct authenticator code, emailed code or backup code completes the login.</w:t>
+            </w:r>
+          </w:p>
+        </w:tc>
+      </w:tr>
+      <w:tr>
+        <w:trPr>
+          <w:cantSplit/>
+        </w:trPr>
+        <w:tc>
+          <w:tcPr>
+            <w:tcW w:type="dxa" w:w="800"/>
+            <w:tcBorders>
+              <w:top w:val="single" w:color="000000" w:sz="4"/>
+              <w:left w:val="single" w:color="000000" w:sz="4"/>
+              <w:bottom w:val="single" w:color="000000" w:sz="4"/>
+              <w:right w:val="single" w:color="000000" w:sz="4"/>
+            </w:tcBorders>
+            <w:tcMar>
+              <w:top w:type="dxa" w:w="70"/>
+              <w:left w:type="dxa" w:w="100"/>
+              <w:bottom w:type="dxa" w:w="70"/>
+              <w:right w:type="dxa" w:w="100"/>
+            </w:tcMar>
+            <w:vAlign w:val="center"/>
+          </w:tcPr>
+          <w:p>
+            <w:pPr>
+              <w:jc w:val="left"/>
+            </w:pPr>
+            <w:r>
+              <w:rPr>
+                <w:b/>
+                <w:bCs/>
+                <w:sz w:val="20"/>
+                <w:szCs w:val="20"/>
+              </w:rPr>
+              <w:t xml:space="preserve">SEC-30</w:t>
+            </w:r>
+          </w:p>
+        </w:tc>
+        <w:tc>
+          <w:tcPr>
+            <w:tcW w:type="dxa" w:w="1350"/>
+            <w:tcBorders>
+              <w:top w:val="single" w:color="000000" w:sz="4"/>
+              <w:left w:val="single" w:color="000000" w:sz="4"/>
+              <w:bottom w:val="single" w:color="000000" w:sz="4"/>
+              <w:right w:val="single" w:color="000000" w:sz="4"/>
+            </w:tcBorders>
+            <w:tcMar>
+              <w:top w:type="dxa" w:w="70"/>
+              <w:left w:type="dxa" w:w="100"/>
+              <w:bottom w:type="dxa" w:w="70"/>
+              <w:right w:type="dxa" w:w="100"/>
+            </w:tcMar>
+            <w:vAlign w:val="center"/>
+          </w:tcPr>
+          <w:p>
+            <w:pPr>
+              <w:jc w:val="left"/>
+            </w:pPr>
+            <w:r>
+              <w:rPr>
+                <w:b w:val="false"/>
+                <w:bCs w:val="false"/>
+                <w:sz w:val="20"/>
+                <w:szCs w:val="20"/>
+              </w:rPr>
+              <w:t xml:space="preserve">TH-02, TH-03</w:t>
+            </w:r>
+          </w:p>
+        </w:tc>
+        <w:tc>
+          <w:tcPr>
+            <w:tcW w:type="dxa" w:w="1200"/>
+            <w:tcBorders>
+              <w:top w:val="single" w:color="000000" w:sz="4"/>
+              <w:left w:val="single" w:color="000000" w:sz="4"/>
+              <w:bottom w:val="single" w:color="000000" w:sz="4"/>
+              <w:right w:val="single" w:color="000000" w:sz="4"/>
+            </w:tcBorders>
+            <w:tcMar>
+              <w:top w:type="dxa" w:w="70"/>
+              <w:left w:type="dxa" w:w="100"/>
+              <w:bottom w:type="dxa" w:w="70"/>
+              <w:right w:type="dxa" w:w="100"/>
+            </w:tcMar>
+            <w:vAlign w:val="center"/>
+          </w:tcPr>
+          <w:p>
+            <w:pPr>
+              <w:jc w:val="left"/>
+            </w:pPr>
+            <w:r>
+              <w:rPr>
+                <w:b w:val="false"/>
+                <w:bCs w:val="false"/>
+                <w:sz w:val="20"/>
+                <w:szCs w:val="20"/>
+              </w:rPr>
+              <w:t xml:space="preserve">OBJ-03</w:t>
+            </w:r>
+          </w:p>
+        </w:tc>
+        <w:tc>
+          <w:tcPr>
+            <w:tcW w:type="dxa" w:w="1050"/>
+            <w:tcBorders>
+              <w:top w:val="single" w:color="000000" w:sz="4"/>
+              <w:left w:val="single" w:color="000000" w:sz="4"/>
+              <w:bottom w:val="single" w:color="000000" w:sz="4"/>
+              <w:right w:val="single" w:color="000000" w:sz="4"/>
+            </w:tcBorders>
+            <w:tcMar>
+              <w:top w:type="dxa" w:w="70"/>
+              <w:left w:type="dxa" w:w="100"/>
+              <w:bottom w:type="dxa" w:w="70"/>
+              <w:right w:type="dxa" w:w="100"/>
+            </w:tcMar>
+            <w:vAlign w:val="center"/>
+          </w:tcPr>
+          <w:p>
+            <w:pPr>
+              <w:jc w:val="center"/>
+            </w:pPr>
+            <w:r>
+              <w:rPr>
+                <w:b w:val="false"/>
+                <w:bCs w:val="false"/>
+                <w:sz w:val="20"/>
+                <w:szCs w:val="20"/>
+              </w:rPr>
+              <w:t xml:space="preserve">High</w:t>
+            </w:r>
+          </w:p>
+        </w:tc>
+        <w:tc>
+          <w:tcPr>
+            <w:tcW w:type="dxa" w:w="1400"/>
+            <w:tcBorders>
+              <w:top w:val="single" w:color="000000" w:sz="4"/>
+              <w:left w:val="single" w:color="000000" w:sz="4"/>
+              <w:bottom w:val="single" w:color="000000" w:sz="4"/>
+              <w:right w:val="single" w:color="000000" w:sz="4"/>
+            </w:tcBorders>
+            <w:tcMar>
+              <w:top w:type="dxa" w:w="70"/>
+              <w:left w:type="dxa" w:w="100"/>
+              <w:bottom w:type="dxa" w:w="70"/>
+              <w:right w:type="dxa" w:w="100"/>
+            </w:tcMar>
+            <w:vAlign w:val="center"/>
+          </w:tcPr>
+          <w:p>
+            <w:pPr>
+              <w:jc w:val="left"/>
+            </w:pPr>
+            <w:r>
+              <w:rPr>
+                <w:b w:val="false"/>
+                <w:bCs w:val="false"/>
+                <w:sz w:val="20"/>
+                <w:szCs w:val="20"/>
+              </w:rPr>
+              <w:t xml:space="preserve">FR-21, UC-01 (3c)</w:t>
+            </w:r>
+          </w:p>
+        </w:tc>
+        <w:tc>
+          <w:tcPr>
+            <w:tcW w:type="dxa" w:w="3600"/>
+            <w:tcBorders>
+              <w:top w:val="single" w:color="000000" w:sz="4"/>
+              <w:left w:val="single" w:color="000000" w:sz="4"/>
+              <w:bottom w:val="single" w:color="000000" w:sz="4"/>
+              <w:right w:val="single" w:color="000000" w:sz="4"/>
+            </w:tcBorders>
+            <w:tcMar>
+              <w:top w:type="dxa" w:w="70"/>
+              <w:left w:type="dxa" w:w="100"/>
+              <w:bottom w:type="dxa" w:w="70"/>
+              <w:right w:type="dxa" w:w="100"/>
+            </w:tcMar>
+            <w:vAlign w:val="center"/>
+          </w:tcPr>
+          <w:p>
+            <w:pPr>
+              <w:jc w:val="left"/>
+            </w:pPr>
+            <w:r>
+              <w:rPr>
+                <w:b w:val="false"/>
+                <w:bCs w:val="false"/>
+                <w:sz w:val="20"/>
+                <w:szCs w:val="20"/>
+              </w:rPr>
+              <w:t xml:space="preserve">Test: at first login the user must scan the QR code and confirm a code before any other page opens. Inspection: logs and emails never contain the setup secret.</w:t>
+            </w:r>
+          </w:p>
+        </w:tc>
+      </w:tr>
+      <w:tr>
+        <w:trPr>
+          <w:cantSplit/>
+        </w:trPr>
+        <w:tc>
+          <w:tcPr>
+            <w:tcW w:type="dxa" w:w="800"/>
+            <w:tcBorders>
+              <w:top w:val="single" w:color="000000" w:sz="4"/>
+              <w:left w:val="single" w:color="000000" w:sz="4"/>
+              <w:bottom w:val="single" w:color="000000" w:sz="4"/>
+              <w:right w:val="single" w:color="000000" w:sz="4"/>
+            </w:tcBorders>
+            <w:tcMar>
+              <w:top w:type="dxa" w:w="70"/>
+              <w:left w:type="dxa" w:w="100"/>
+              <w:bottom w:type="dxa" w:w="70"/>
+              <w:right w:type="dxa" w:w="100"/>
+            </w:tcMar>
+            <w:vAlign w:val="center"/>
+          </w:tcPr>
+          <w:p>
+            <w:pPr>
+              <w:jc w:val="left"/>
+            </w:pPr>
+            <w:r>
+              <w:rPr>
+                <w:b/>
+                <w:bCs/>
+                <w:sz w:val="20"/>
+                <w:szCs w:val="20"/>
+              </w:rPr>
+              <w:t xml:space="preserve">SEC-31</w:t>
+            </w:r>
+          </w:p>
+        </w:tc>
+        <w:tc>
+          <w:tcPr>
+            <w:tcW w:type="dxa" w:w="1350"/>
+            <w:tcBorders>
+              <w:top w:val="single" w:color="000000" w:sz="4"/>
+              <w:left w:val="single" w:color="000000" w:sz="4"/>
+              <w:bottom w:val="single" w:color="000000" w:sz="4"/>
+              <w:right w:val="single" w:color="000000" w:sz="4"/>
+            </w:tcBorders>
+            <w:tcMar>
+              <w:top w:type="dxa" w:w="70"/>
+              <w:left w:type="dxa" w:w="100"/>
+              <w:bottom w:type="dxa" w:w="70"/>
+              <w:right w:type="dxa" w:w="100"/>
+            </w:tcMar>
+            <w:vAlign w:val="center"/>
+          </w:tcPr>
+          <w:p>
+            <w:pPr>
+              <w:jc w:val="left"/>
+            </w:pPr>
+            <w:r>
+              <w:rPr>
+                <w:b w:val="false"/>
+                <w:bCs w:val="false"/>
+                <w:sz w:val="20"/>
+                <w:szCs w:val="20"/>
+              </w:rPr>
+              <w:t xml:space="preserve">TH-02, TH-12</w:t>
+            </w:r>
+          </w:p>
+        </w:tc>
+        <w:tc>
+          <w:tcPr>
+            <w:tcW w:type="dxa" w:w="1200"/>
+            <w:tcBorders>
+              <w:top w:val="single" w:color="000000" w:sz="4"/>
+              <w:left w:val="single" w:color="000000" w:sz="4"/>
+              <w:bottom w:val="single" w:color="000000" w:sz="4"/>
+              <w:right w:val="single" w:color="000000" w:sz="4"/>
+            </w:tcBorders>
+            <w:tcMar>
+              <w:top w:type="dxa" w:w="70"/>
+              <w:left w:type="dxa" w:w="100"/>
+              <w:bottom w:type="dxa" w:w="70"/>
+              <w:right w:type="dxa" w:w="100"/>
+            </w:tcMar>
+            <w:vAlign w:val="center"/>
+          </w:tcPr>
+          <w:p>
+            <w:pPr>
+              <w:jc w:val="left"/>
+            </w:pPr>
+            <w:r>
+              <w:rPr>
+                <w:b w:val="false"/>
+                <w:bCs w:val="false"/>
+                <w:sz w:val="20"/>
+                <w:szCs w:val="20"/>
+              </w:rPr>
+              <w:t xml:space="preserve">OBJ-04</w:t>
+            </w:r>
+          </w:p>
+        </w:tc>
+        <w:tc>
+          <w:tcPr>
+            <w:tcW w:type="dxa" w:w="1050"/>
+            <w:tcBorders>
+              <w:top w:val="single" w:color="000000" w:sz="4"/>
+              <w:left w:val="single" w:color="000000" w:sz="4"/>
+              <w:bottom w:val="single" w:color="000000" w:sz="4"/>
+              <w:right w:val="single" w:color="000000" w:sz="4"/>
+            </w:tcBorders>
+            <w:tcMar>
+              <w:top w:type="dxa" w:w="70"/>
+              <w:left w:type="dxa" w:w="100"/>
+              <w:bottom w:type="dxa" w:w="70"/>
+              <w:right w:type="dxa" w:w="100"/>
+            </w:tcMar>
+            <w:vAlign w:val="center"/>
+          </w:tcPr>
+          <w:p>
+            <w:pPr>
+              <w:jc w:val="center"/>
+            </w:pPr>
+            <w:r>
+              <w:rPr>
+                <w:b w:val="false"/>
+                <w:bCs w:val="false"/>
+                <w:sz w:val="20"/>
+                <w:szCs w:val="20"/>
+              </w:rPr>
+              <w:t xml:space="preserve">High</w:t>
+            </w:r>
+          </w:p>
+        </w:tc>
+        <w:tc>
+          <w:tcPr>
+            <w:tcW w:type="dxa" w:w="1400"/>
+            <w:tcBorders>
+              <w:top w:val="single" w:color="000000" w:sz="4"/>
+              <w:left w:val="single" w:color="000000" w:sz="4"/>
+              <w:bottom w:val="single" w:color="000000" w:sz="4"/>
+              <w:right w:val="single" w:color="000000" w:sz="4"/>
+            </w:tcBorders>
+            <w:tcMar>
+              <w:top w:type="dxa" w:w="70"/>
+              <w:left w:type="dxa" w:w="100"/>
+              <w:bottom w:type="dxa" w:w="70"/>
+              <w:right w:type="dxa" w:w="100"/>
+            </w:tcMar>
+            <w:vAlign w:val="center"/>
+          </w:tcPr>
+          <w:p>
+            <w:pPr>
+              <w:jc w:val="left"/>
+            </w:pPr>
+            <w:r>
+              <w:rPr>
+                <w:b w:val="false"/>
+                <w:bCs w:val="false"/>
+                <w:sz w:val="20"/>
+                <w:szCs w:val="20"/>
+              </w:rPr>
+              <w:t xml:space="preserve">FR-21, UC-01 (4b)</w:t>
+            </w:r>
+          </w:p>
+        </w:tc>
+        <w:tc>
+          <w:tcPr>
+            <w:tcW w:type="dxa" w:w="3600"/>
+            <w:tcBorders>
+              <w:top w:val="single" w:color="000000" w:sz="4"/>
+              <w:left w:val="single" w:color="000000" w:sz="4"/>
+              <w:bottom w:val="single" w:color="000000" w:sz="4"/>
+              <w:right w:val="single" w:color="000000" w:sz="4"/>
+            </w:tcBorders>
+            <w:tcMar>
+              <w:top w:type="dxa" w:w="70"/>
+              <w:left w:type="dxa" w:w="100"/>
+              <w:bottom w:type="dxa" w:w="70"/>
+              <w:right w:type="dxa" w:w="100"/>
+            </w:tcMar>
+            <w:vAlign w:val="center"/>
+          </w:tcPr>
+          <w:p>
+            <w:pPr>
+              <w:jc w:val="left"/>
+            </w:pPr>
+            <w:r>
+              <w:rPr>
+                <w:b w:val="false"/>
+                <w:bCs w:val="false"/>
+                <w:sz w:val="20"/>
+                <w:szCs w:val="20"/>
+              </w:rPr>
+              <w:t xml:space="preserve">Test: a backup code works once and fails on reuse; an Admin reset without re-entering the password is refused; a reset is logged and forces setup at next login.</w:t>
+            </w:r>
+          </w:p>
+        </w:tc>
+      </w:tr>
+      <w:tr>
+        <w:trPr>
+          <w:cantSplit/>
+        </w:trPr>
+        <w:tc>
+          <w:tcPr>
+            <w:tcW w:type="dxa" w:w="800"/>
+            <w:tcBorders>
+              <w:top w:val="single" w:color="000000" w:sz="4"/>
+              <w:left w:val="single" w:color="000000" w:sz="4"/>
+              <w:bottom w:val="single" w:color="000000" w:sz="4"/>
+              <w:right w:val="single" w:color="000000" w:sz="4"/>
+            </w:tcBorders>
+            <w:tcMar>
+              <w:top w:type="dxa" w:w="70"/>
+              <w:left w:type="dxa" w:w="100"/>
+              <w:bottom w:type="dxa" w:w="70"/>
+              <w:right w:type="dxa" w:w="100"/>
+            </w:tcMar>
+            <w:vAlign w:val="center"/>
+          </w:tcPr>
+          <w:p>
+            <w:pPr>
+              <w:jc w:val="left"/>
+            </w:pPr>
+            <w:r>
+              <w:rPr>
+                <w:b/>
+                <w:bCs/>
+                <w:sz w:val="20"/>
+                <w:szCs w:val="20"/>
+              </w:rPr>
+              <w:t xml:space="preserve">SEC-32</w:t>
+            </w:r>
+          </w:p>
+        </w:tc>
+        <w:tc>
+          <w:tcPr>
+            <w:tcW w:type="dxa" w:w="1350"/>
+            <w:tcBorders>
+              <w:top w:val="single" w:color="000000" w:sz="4"/>
+              <w:left w:val="single" w:color="000000" w:sz="4"/>
+              <w:bottom w:val="single" w:color="000000" w:sz="4"/>
+              <w:right w:val="single" w:color="000000" w:sz="4"/>
+            </w:tcBorders>
+            <w:tcMar>
+              <w:top w:type="dxa" w:w="70"/>
+              <w:left w:type="dxa" w:w="100"/>
+              <w:bottom w:type="dxa" w:w="70"/>
+              <w:right w:type="dxa" w:w="100"/>
+            </w:tcMar>
+            <w:vAlign w:val="center"/>
+          </w:tcPr>
+          <w:p>
+            <w:pPr>
+              <w:jc w:val="left"/>
+            </w:pPr>
+            <w:r>
+              <w:rPr>
+                <w:b w:val="false"/>
+                <w:bCs w:val="false"/>
+                <w:sz w:val="20"/>
+                <w:szCs w:val="20"/>
+              </w:rPr>
+              <w:t xml:space="preserve">TH-01</w:t>
+            </w:r>
+          </w:p>
+        </w:tc>
+        <w:tc>
+          <w:tcPr>
+            <w:tcW w:type="dxa" w:w="1200"/>
+            <w:tcBorders>
+              <w:top w:val="single" w:color="000000" w:sz="4"/>
+              <w:left w:val="single" w:color="000000" w:sz="4"/>
+              <w:bottom w:val="single" w:color="000000" w:sz="4"/>
+              <w:right w:val="single" w:color="000000" w:sz="4"/>
+            </w:tcBorders>
+            <w:tcMar>
+              <w:top w:type="dxa" w:w="70"/>
+              <w:left w:type="dxa" w:w="100"/>
+              <w:bottom w:type="dxa" w:w="70"/>
+              <w:right w:type="dxa" w:w="100"/>
+            </w:tcMar>
+            <w:vAlign w:val="center"/>
+          </w:tcPr>
+          <w:p>
+            <w:pPr>
+              <w:jc w:val="left"/>
+            </w:pPr>
+            <w:r>
+              <w:rPr>
+                <w:b w:val="false"/>
+                <w:bCs w:val="false"/>
+                <w:sz w:val="20"/>
+                <w:szCs w:val="20"/>
+              </w:rPr>
+              <w:t xml:space="preserve">OBJ-03</w:t>
+            </w:r>
+          </w:p>
+        </w:tc>
+        <w:tc>
+          <w:tcPr>
+            <w:tcW w:type="dxa" w:w="1050"/>
+            <w:tcBorders>
+              <w:top w:val="single" w:color="000000" w:sz="4"/>
+              <w:left w:val="single" w:color="000000" w:sz="4"/>
+              <w:bottom w:val="single" w:color="000000" w:sz="4"/>
+              <w:right w:val="single" w:color="000000" w:sz="4"/>
+            </w:tcBorders>
+            <w:tcMar>
+              <w:top w:type="dxa" w:w="70"/>
+              <w:left w:type="dxa" w:w="100"/>
+              <w:bottom w:type="dxa" w:w="70"/>
+              <w:right w:type="dxa" w:w="100"/>
+            </w:tcMar>
+            <w:vAlign w:val="center"/>
+          </w:tcPr>
+          <w:p>
+            <w:pPr>
+              <w:jc w:val="center"/>
+            </w:pPr>
+            <w:r>
+              <w:rPr>
+                <w:b w:val="false"/>
+                <w:bCs w:val="false"/>
+                <w:sz w:val="20"/>
+                <w:szCs w:val="20"/>
+              </w:rPr>
+              <w:t xml:space="preserve">High</w:t>
+            </w:r>
+          </w:p>
+        </w:tc>
+        <w:tc>
+          <w:tcPr>
+            <w:tcW w:type="dxa" w:w="1400"/>
+            <w:tcBorders>
+              <w:top w:val="single" w:color="000000" w:sz="4"/>
+              <w:left w:val="single" w:color="000000" w:sz="4"/>
+              <w:bottom w:val="single" w:color="000000" w:sz="4"/>
+              <w:right w:val="single" w:color="000000" w:sz="4"/>
+            </w:tcBorders>
+            <w:tcMar>
+              <w:top w:type="dxa" w:w="70"/>
+              <w:left w:type="dxa" w:w="100"/>
+              <w:bottom w:type="dxa" w:w="70"/>
+              <w:right w:type="dxa" w:w="100"/>
+            </w:tcMar>
+            <w:vAlign w:val="center"/>
+          </w:tcPr>
+          <w:p>
+            <w:pPr>
+              <w:jc w:val="left"/>
+            </w:pPr>
+            <w:r>
+              <w:rPr>
+                <w:b w:val="false"/>
+                <w:bCs w:val="false"/>
+                <w:sz w:val="20"/>
+                <w:szCs w:val="20"/>
+              </w:rPr>
+              <w:t xml:space="preserve">FR-21, UC-01 (4a)</w:t>
+            </w:r>
+          </w:p>
+        </w:tc>
+        <w:tc>
+          <w:tcPr>
+            <w:tcW w:type="dxa" w:w="3600"/>
+            <w:tcBorders>
+              <w:top w:val="single" w:color="000000" w:sz="4"/>
+              <w:left w:val="single" w:color="000000" w:sz="4"/>
+              <w:bottom w:val="single" w:color="000000" w:sz="4"/>
+              <w:right w:val="single" w:color="000000" w:sz="4"/>
+            </w:tcBorders>
+            <w:tcMar>
+              <w:top w:type="dxa" w:w="70"/>
+              <w:left w:type="dxa" w:w="100"/>
+              <w:bottom w:type="dxa" w:w="70"/>
+              <w:right w:type="dxa" w:w="100"/>
+            </w:tcMar>
+            <w:vAlign w:val="center"/>
+          </w:tcPr>
+          <w:p>
+            <w:pPr>
+              <w:jc w:val="left"/>
+            </w:pPr>
+            <w:r>
+              <w:rPr>
+                <w:b w:val="false"/>
+                <w:bCs w:val="false"/>
+                <w:sz w:val="20"/>
+                <w:szCs w:val="20"/>
+              </w:rPr>
+              <w:t xml:space="preserve">Test: 5 wrong codes lock the account for 15 minutes; an emailed code fails after 10 minutes and on reuse; a 4th email request within 15 minutes is refused; every attempt is logged.</w:t>
             </w:r>
           </w:p>
         </w:tc>

</xml_diff>

<commit_message>
Email temporary login details to account owners
</commit_message>
<xml_diff>
--- a/Documents/Security_Requirements_Specification.docx
+++ b/Documents/Security_Requirements_Specification.docx
@@ -7797,7 +7797,7 @@
                 <w:sz w:val="20"/>
                 <w:szCs w:val="20"/>
               </w:rPr>
-              <w:t xml:space="preserve">Accounts created by the Admin use a one-time temporary password, and the user must change it at first login.</w:t>
+              <w:t xml:space="preserve">Accounts created by the Admin use a one-time temporary password, and the user must change it at first login. For student/faculty creation and password resets, deliver credentials only to the account owner; use the BL-34 one-time fallback and rotating resend rules.</w:t>
             </w:r>
           </w:p>
         </w:tc>
@@ -9716,7 +9716,7 @@
                 <w:sz w:val="20"/>
                 <w:szCs w:val="20"/>
               </w:rPr>
-              <w:t xml:space="preserve">Low-attendance notifications go only to the affected student; faculty receive only the list of their own students below the threshold. Both contain minimal personal data.</w:t>
+              <w:t xml:space="preserve">Low-attendance notifications go only to the affected student; faculty receive only their own shortage list. Login-details emails contain only username, temporary password, login link and instructions, and go only to that account owner with no copies.</w:t>
             </w:r>
           </w:p>
         </w:tc>
@@ -16988,6 +16988,151 @@
         </w:tc>
       </w:tr>
     </w:tbl>
+    <w:p>
+      <w:pPr>
+        <w:keepNext/>
+        <w:pageBreakBefore/>
+        <w:spacing w:before="0" w:after="140" w:line="260" w:lineRule="auto"/>
+      </w:pPr>
+      <w:r>
+        <w:rPr>
+          <w:rFonts w:ascii="Calibri" w:hAnsi="Calibri"/>
+          <w:b/>
+          <w:sz w:val="28"/>
+        </w:rPr>
+        <w:t>BL-34 Addendum: Email login details</w:t>
+      </w:r>
+    </w:p>
+    <w:p>
+      <w:pPr>
+        <w:keepNext/>
+        <w:spacing w:before="0" w:after="140" w:line="260" w:lineRule="auto"/>
+      </w:pPr>
+      <w:r>
+        <w:rPr>
+          <w:rFonts w:ascii="Calibri" w:hAnsi="Calibri"/>
+          <w:b/>
+          <w:sz w:val="28"/>
+        </w:rPr>
+        <w:t>Controls affected</w:t>
+      </w:r>
+    </w:p>
+    <w:p>
+      <w:pPr>
+        <w:spacing w:before="0" w:after="140" w:line="260" w:lineRule="auto"/>
+      </w:pPr>
+      <w:r>
+        <w:rPr>
+          <w:rFonts w:ascii="Calibri" w:hAnsi="Calibri"/>
+          <w:sz w:val="21"/>
+        </w:rPr>
+        <w:t>BL-34 (#42), 29 October 2026. Applies SEC-05, SEC-06, SEC-16, SEC-25, SEC-27 and SEC-28 to credential emails. Only active Admins may issue or resend credentials; CSRF-protected POST is required for reset/resend.</w:t>
+      </w:r>
+    </w:p>
+    <w:p>
+      <w:pPr>
+        <w:keepNext/>
+        <w:spacing w:before="0" w:after="140" w:line="260" w:lineRule="auto"/>
+      </w:pPr>
+      <w:r>
+        <w:rPr>
+          <w:rFonts w:ascii="Calibri" w:hAnsi="Calibri"/>
+          <w:b/>
+          <w:sz w:val="28"/>
+        </w:rPr>
+        <w:t>Scope and delivery</w:t>
+      </w:r>
+    </w:p>
+    <w:p>
+      <w:pPr>
+        <w:spacing w:before="0" w:after="140" w:line="260" w:lineRule="auto"/>
+      </w:pPr>
+      <w:r>
+        <w:rPr>
+          <w:rFonts w:ascii="Calibri" w:hAnsi="Calibri"/>
+          <w:sz w:val="21"/>
+        </w:rPr>
+        <w:t>After the Admin saves a new student or faculty profile, or resets a password, send only the account owner their username, new temporary password and trusted SITE_URL login link. Include the first-login password-change instruction. No CC/BCC, other personal data or academic data is included.</w:t>
+      </w:r>
+    </w:p>
+    <w:p>
+      <w:pPr>
+        <w:keepNext/>
+        <w:spacing w:before="0" w:after="140" w:line="260" w:lineRule="auto"/>
+      </w:pPr>
+      <w:r>
+        <w:rPr>
+          <w:rFonts w:ascii="Calibri" w:hAnsi="Calibri"/>
+          <w:b/>
+          <w:sz w:val="28"/>
+        </w:rPr>
+        <w:t>Failure and recovery</w:t>
+      </w:r>
+    </w:p>
+    <w:p>
+      <w:pPr>
+        <w:spacing w:before="0" w:after="140" w:line="260" w:lineRule="auto"/>
+      </w:pPr>
+      <w:r>
+        <w:rPr>
+          <w:rFonts w:ascii="Calibri" w:hAnsi="Calibri"/>
+          <w:sz w:val="21"/>
+        </w:rPr>
+        <w:t>Report delivery to a masked address. If sending fails, keep the saved account and show its temporary password once on the non-cacheable Admin response. Resend is an Admin-only POST for active temporary-password accounts: generate a fresh password, invalidate the old one and audit the resend. A user who already changed the password requires an explicit reset.</w:t>
+      </w:r>
+    </w:p>
+    <w:p>
+      <w:pPr>
+        <w:keepNext/>
+        <w:spacing w:before="0" w:after="140" w:line="260" w:lineRule="auto"/>
+      </w:pPr>
+      <w:r>
+        <w:rPr>
+          <w:rFonts w:ascii="Calibri" w:hAnsi="Calibri"/>
+          <w:b/>
+          <w:sz w:val="28"/>
+        </w:rPr>
+        <w:t>Security and configuration</w:t>
+      </w:r>
+    </w:p>
+    <w:p>
+      <w:pPr>
+        <w:spacing w:before="0" w:after="140" w:line="260" w:lineRule="auto"/>
+      </w:pPr>
+      <w:r>
+        <w:rPr>
+          <w:rFonts w:ascii="Calibri" w:hAnsi="Calibri"/>
+          <w:sz w:val="21"/>
+        </w:rPr>
+        <w:t>Persist only the password hash. Never put the password, email body or provider exception text in sessions, audit records or production logs. Audit attempts and outcomes with purpose and a masked address. Read SMTP settings and SITE_URL from .env; production links use HTTPS and never the request Host header. Development console previews use fictional accounts only and are explicitly labelled as not delivered.</w:t>
+      </w:r>
+    </w:p>
+    <w:p>
+      <w:pPr>
+        <w:keepNext/>
+        <w:spacing w:before="0" w:after="140" w:line="260" w:lineRule="auto"/>
+      </w:pPr>
+      <w:r>
+        <w:rPr>
+          <w:rFonts w:ascii="Calibri" w:hAnsi="Calibri"/>
+          <w:b/>
+          <w:sz w:val="28"/>
+        </w:rPr>
+        <w:t>Additional safeguards</w:t>
+      </w:r>
+    </w:p>
+    <w:p>
+      <w:pPr>
+        <w:spacing w:before="0" w:after="140" w:line="260" w:lineRule="auto"/>
+      </w:pPr>
+      <w:r>
+        <w:rPr>
+          <w:rFonts w:ascii="Calibri" w:hAnsi="Calibri"/>
+          <w:sz w:val="21"/>
+        </w:rPr>
+        <w:t>Reject zero-message transport results, unsafe login URLs and stale temporary passwords. Recheck the current account under a row lock before sending. Refuse production console and file-based/dummy delivery backends. Failed attempts remain auditable without recording provider exceptions. Console previews are the explicit development-only exception to production log restrictions; never persist them.</w:t>
+      </w:r>
+    </w:p>
     <w:sectPr>
       <w:footerReference w:type="default" r:id="rId7"/>
       <w:pgSz w:w="12240" w:h="15840" w:orient="portrait"/>

</xml_diff>